<commit_message>
Complete every loose end that does not require a human, and flag the rest
Drafted the actual pre-trip and post-trip workshop content (previously
a placeholder), facilitator bios from verified real facts, Statement
of Certification and financial misconduct disclosure templates, and
ready-to-send outreach messages for everyone whose input is still
needed (Adam Hickson, Stephanie, Phileke, Cole Bradshaw, Arena Stage
Group Sales). Added the qualitative evaluation component the Addendum
A review flagged as missing.

Added a readiness summary that draws an explicit line between what's
now finished and the roughly dozen items that structurally require a
real person: Neo's approval, a call to Arena Stage, real work samples,
real compliance documents, and Darius's signature. None of that can be
closed by drafting alone, and the summary says so plainly rather than
overclaiming readiness.
</commit_message>
<xml_diff>
--- a/app/drafts/exports/DC Arts and Humanities Submission Narrative.docx
+++ b/app/drafts/exports/DC Arts and Humanities Submission Narrative.docx
@@ -626,27 +626,52 @@
     </w:p>
     <w:p>
       <w:r>
-        <w:t>[TO ATTACH: not yet compiled: sample pre-trip workshop lesson plan; post-trip reflection</w:t>
+        <w:t>The pre-trip workshop ("Stepping Into Story") and post-trip reflection ("What Stepping Taught</w:t>
       </w:r>
     </w:p>
     <w:p>
       <w:r>
-        <w:t>activity outline; any photo/video documentation from GOODLearningHub's existing GOODSports dance</w:t>
+        <w:t>Us") are fully drafted, with objectives, sequencing, and curriculum alignment, in the companion</w:t>
       </w:r>
     </w:p>
     <w:p>
       <w:r>
-        <w:t>programming as a comparable prior arts-engagement work sample; facilitator bios for Stephanie</w:t>
+        <w:t>document `2026-07-dc-arts-humanities-lesson-plans.md`, along with facilitator bios for Stephanie</w:t>
       </w:r>
     </w:p>
     <w:p>
       <w:r>
-        <w:t>Page-Baxter and Phileke Holland. CAH panelists review only what is physically included in the</w:t>
+        <w:t>Page-Baxter and Phileke Holland. These are ready to attach as-is.</w:t>
       </w:r>
     </w:p>
     <w:p>
       <w:r>
-        <w:t>application: none of this can be represented by a website link.]</w:t>
+        <w:t>STILL OUTSTANDING (cannot be completed without direct human input): photo or video documentation</w:t>
+      </w:r>
+    </w:p>
+    <w:p>
+      <w:r>
+        <w:t>of GOODProjects' past arts programming (GOODSports dance, the Christmas Play, the Family Arts &amp;</w:t>
+      </w:r>
+    </w:p>
+    <w:p>
+      <w:r>
+        <w:t>Craft Festival) as a comparable prior work sample, and each facilitator's ward or state of</w:t>
+      </w:r>
+    </w:p>
+    <w:p>
+      <w:r>
+        <w:t>residence. CAH panelists review only what is physically included in the application; none of this</w:t>
+      </w:r>
+    </w:p>
+    <w:p>
+      <w:r>
+        <w:t>can be represented by a website link, so these need to be sourced and attached directly, not</w:t>
+      </w:r>
+    </w:p>
+    <w:p>
+      <w:r>
+        <w:t>referenced.</w:t>
       </w:r>
     </w:p>
     <w:p>
@@ -1127,6 +1152,26 @@
       </w:tr>
     </w:tbl>
     <w:p/>
+    <w:p>
+      <w:r>
+        <w:t>These quantitative measures are paired with a qualitative component: the post-trip reflection</w:t>
+      </w:r>
+    </w:p>
+    <w:p>
+      <w:r>
+        <w:t>session ("What Stepping Taught Us," detailed in the companion lesson plan document) produces</w:t>
+      </w:r>
+    </w:p>
+    <w:p>
+      <w:r>
+        <w:t>actual written or verbal student reflections, collected as narrative evidence of how students</w:t>
+      </w:r>
+    </w:p>
+    <w:p>
+      <w:r>
+        <w:t>connected the performance to their own identity and community, not just whether they did.</w:t>
+      </w:r>
+    </w:p>
     <w:p>
       <w:r>
         <w:t>GOODLearningHub already uses structured tracking tools (attendance records, session notes, and</w:t>

</xml_diff>